<commit_message>
docs: Update Sales Listing to Agenturer.no standard format
</commit_message>
<xml_diff>
--- a/Salgsannonse_Hubzzoo_CRM.docx
+++ b/Salgsannonse_Hubzzoo_CRM.docx
@@ -9,23 +9,279 @@
       <w:r>
         <w:rPr>
           <w:b/>
-          <w:color w:val="0F172A"/>
-          <w:sz w:val="48"/>
+          <w:color w:val="269DD8"/>
+          <w:sz w:val="20"/>
         </w:rPr>
-        <w:t>SALGSPROSPEKT &amp; ANNONSE</w:t>
+        <w:t>AGENTURER.NO — SALGSANNONSE &amp; FORRETNINGSMULIGHET</w:t>
       </w:r>
     </w:p>
     <w:p>
       <w:pPr>
-        <w:spacing w:after="280"/>
+        <w:spacing w:after="80"/>
       </w:pPr>
       <w:r>
         <w:rPr>
           <w:b/>
-          <w:color w:val="2563EB"/>
-          <w:sz w:val="28"/>
+          <w:color w:val="0F172A"/>
+          <w:sz w:val="40"/>
         </w:rPr>
-        <w:t>Hubzzoo (hubzzoo.ai.studio) — AI Executive CRM [Nøkkelferdig SaaS]</w:t>
+        <w:t>Unik mulighet: Selges – Komplett AI-drevet CRM- og Salgsplattform (Hubzzoo.ai.studio)</w:t>
+      </w:r>
+    </w:p>
+    <w:p>
+      <w:pPr>
+        <w:spacing w:after="240"/>
+      </w:pPr>
+      <w:r>
+        <w:rPr>
+          <w:color w:val="334155"/>
+          <w:sz w:val="24"/>
+        </w:rPr>
+        <w:t>Nøkkelferdig SaaS-virksomhet med Google Gemini AI, Stripe-betaling og automatisk lead-oppfølging.</w:t>
+      </w:r>
+    </w:p>
+    <w:tbl>
+      <w:tblPr>
+        <w:tblW w:type="auto" w:w="0"/>
+        <w:jc w:val="center"/>
+        <w:tblLook w:firstColumn="1" w:firstRow="1" w:lastColumn="0" w:lastRow="0" w:noHBand="0" w:noVBand="1" w:val="04A0"/>
+      </w:tblPr>
+      <w:tblGrid>
+        <w:gridCol w:w="4680"/>
+        <w:gridCol w:w="4680"/>
+      </w:tblGrid>
+      <w:tr>
+        <w:tc>
+          <w:tcPr>
+            <w:tcW w:type="dxa" w:w="3168"/>
+            <w:shd w:fill="F1F5F9"/>
+            <w:tcMar>
+              <w:top w:w="60" w:type="dxa"/>
+              <w:bottom w:w="60" w:type="dxa"/>
+              <w:left w:w="100" w:type="dxa"/>
+              <w:right w:w="100" w:type="dxa"/>
+            </w:tcMar>
+          </w:tcPr>
+          <w:p>
+            <w:r>
+              <w:rPr>
+                <w:b/>
+                <w:sz w:val="19"/>
+              </w:rPr>
+              <w:t>Områder:</w:t>
+            </w:r>
+          </w:p>
+        </w:tc>
+        <w:tc>
+          <w:tcPr>
+            <w:tcW w:type="dxa" w:w="6192"/>
+            <w:shd w:fill="F8FAFC"/>
+            <w:tcMar>
+              <w:top w:w="60" w:type="dxa"/>
+              <w:bottom w:w="60" w:type="dxa"/>
+              <w:left w:w="100" w:type="dxa"/>
+              <w:right w:w="100" w:type="dxa"/>
+            </w:tcMar>
+          </w:tcPr>
+          <w:p>
+            <w:r>
+              <w:rPr>
+                <w:sz w:val="19"/>
+              </w:rPr>
+              <w:t>Hele Norge / Globalt / Jobb hjemmefra</w:t>
+            </w:r>
+          </w:p>
+        </w:tc>
+      </w:tr>
+      <w:tr>
+        <w:tc>
+          <w:tcPr>
+            <w:tcW w:type="dxa" w:w="3168"/>
+            <w:shd w:fill="F1F5F9"/>
+            <w:tcMar>
+              <w:top w:w="60" w:type="dxa"/>
+              <w:bottom w:w="60" w:type="dxa"/>
+              <w:left w:w="100" w:type="dxa"/>
+              <w:right w:w="100" w:type="dxa"/>
+            </w:tcMar>
+          </w:tcPr>
+          <w:p>
+            <w:r>
+              <w:rPr>
+                <w:b/>
+                <w:sz w:val="19"/>
+              </w:rPr>
+              <w:t>Selger til:</w:t>
+            </w:r>
+          </w:p>
+        </w:tc>
+        <w:tc>
+          <w:tcPr>
+            <w:tcW w:type="dxa" w:w="6192"/>
+            <w:shd w:fill="F8FAFC"/>
+            <w:tcMar>
+              <w:top w:w="60" w:type="dxa"/>
+              <w:bottom w:w="60" w:type="dxa"/>
+              <w:left w:w="100" w:type="dxa"/>
+              <w:right w:w="100" w:type="dxa"/>
+            </w:tcMar>
+          </w:tcPr>
+          <w:p>
+            <w:r>
+              <w:rPr>
+                <w:sz w:val="19"/>
+              </w:rPr>
+              <w:t>B2B, bedrifter, konsulenter, salgsteam og SMB</w:t>
+            </w:r>
+          </w:p>
+        </w:tc>
+      </w:tr>
+      <w:tr>
+        <w:tc>
+          <w:tcPr>
+            <w:tcW w:type="dxa" w:w="3168"/>
+            <w:shd w:fill="F1F5F9"/>
+            <w:tcMar>
+              <w:top w:w="60" w:type="dxa"/>
+              <w:bottom w:w="60" w:type="dxa"/>
+              <w:left w:w="100" w:type="dxa"/>
+              <w:right w:w="100" w:type="dxa"/>
+            </w:tcMar>
+          </w:tcPr>
+          <w:p>
+            <w:r>
+              <w:rPr>
+                <w:b/>
+                <w:sz w:val="19"/>
+              </w:rPr>
+              <w:t>Type mulighet:</w:t>
+            </w:r>
+          </w:p>
+        </w:tc>
+        <w:tc>
+          <w:tcPr>
+            <w:tcW w:type="dxa" w:w="6192"/>
+            <w:shd w:fill="F8FAFC"/>
+            <w:tcMar>
+              <w:top w:w="60" w:type="dxa"/>
+              <w:bottom w:w="60" w:type="dxa"/>
+              <w:left w:w="100" w:type="dxa"/>
+              <w:right w:w="100" w:type="dxa"/>
+            </w:tcMar>
+          </w:tcPr>
+          <w:p>
+            <w:r>
+              <w:rPr>
+                <w:sz w:val="19"/>
+              </w:rPr>
+              <w:t>Selskap / SaaS-virksomhet til salgs</w:t>
+            </w:r>
+          </w:p>
+        </w:tc>
+      </w:tr>
+      <w:tr>
+        <w:tc>
+          <w:tcPr>
+            <w:tcW w:type="dxa" w:w="3168"/>
+            <w:shd w:fill="F1F5F9"/>
+            <w:tcMar>
+              <w:top w:w="60" w:type="dxa"/>
+              <w:bottom w:w="60" w:type="dxa"/>
+              <w:left w:w="100" w:type="dxa"/>
+              <w:right w:w="100" w:type="dxa"/>
+            </w:tcMar>
+          </w:tcPr>
+          <w:p>
+            <w:r>
+              <w:rPr>
+                <w:b/>
+                <w:sz w:val="19"/>
+              </w:rPr>
+              <w:t>Betingelser:</w:t>
+            </w:r>
+          </w:p>
+        </w:tc>
+        <w:tc>
+          <w:tcPr>
+            <w:tcW w:type="dxa" w:w="6192"/>
+            <w:shd w:fill="F8FAFC"/>
+            <w:tcMar>
+              <w:top w:w="60" w:type="dxa"/>
+              <w:bottom w:w="60" w:type="dxa"/>
+              <w:left w:w="100" w:type="dxa"/>
+              <w:right w:w="100" w:type="dxa"/>
+            </w:tcMar>
+          </w:tcPr>
+          <w:p>
+            <w:r>
+              <w:rPr>
+                <w:sz w:val="19"/>
+              </w:rPr>
+              <w:t>Kjøpesum: Kr. 129 000,- NOK (Driftsavtale: Kr. 3 990,-/mnd)</w:t>
+            </w:r>
+          </w:p>
+        </w:tc>
+      </w:tr>
+      <w:tr>
+        <w:tc>
+          <w:tcPr>
+            <w:tcW w:type="dxa" w:w="3168"/>
+            <w:shd w:fill="F1F5F9"/>
+            <w:tcMar>
+              <w:top w:w="60" w:type="dxa"/>
+              <w:bottom w:w="60" w:type="dxa"/>
+              <w:left w:w="100" w:type="dxa"/>
+              <w:right w:w="100" w:type="dxa"/>
+            </w:tcMar>
+          </w:tcPr>
+          <w:p>
+            <w:r>
+              <w:rPr>
+                <w:b/>
+                <w:sz w:val="19"/>
+              </w:rPr>
+              <w:t>Salgskanaler:</w:t>
+            </w:r>
+          </w:p>
+        </w:tc>
+        <w:tc>
+          <w:tcPr>
+            <w:tcW w:type="dxa" w:w="6192"/>
+            <w:shd w:fill="F8FAFC"/>
+            <w:tcMar>
+              <w:top w:w="60" w:type="dxa"/>
+              <w:bottom w:w="60" w:type="dxa"/>
+              <w:left w:w="100" w:type="dxa"/>
+              <w:right w:w="100" w:type="dxa"/>
+            </w:tcMar>
+          </w:tcPr>
+          <w:p>
+            <w:r>
+              <w:rPr>
+                <w:sz w:val="19"/>
+              </w:rPr>
+              <w:t>Webmøter, telefon, online markedsføring, AppSumo</w:t>
+            </w:r>
+          </w:p>
+        </w:tc>
+      </w:tr>
+    </w:tbl>
+    <w:p>
+      <w:pPr>
+        <w:spacing w:after="160"/>
+      </w:pPr>
+    </w:p>
+    <w:p>
+      <w:pPr>
+        <w:spacing w:after="80" w:line="276" w:lineRule="auto"/>
+      </w:pPr>
+      <w:r>
+        <w:rPr>
+          <w:b w:val="0"/>
+          <w:color w:val="334155"/>
+          <w:sz w:val="21"/>
+        </w:rPr>
+        <w:t>Er du på jakt etter en ferdigrigget «Software as a Service» (SaaS) i det eksploderende markedet for AI og salgsautomatisering? Hubzzoo CRM (hubzzoo.ai.studio) er nå til salgs – et komplett, moderne CRM-system bygget for å gi bedrifter og salgsteam en automatisert salgshverdag.</w:t>
       </w:r>
     </w:p>
     <w:p>
@@ -38,7 +294,7 @@
           <w:color w:val="334155"/>
           <w:sz w:val="21"/>
         </w:rPr>
-        <w:t>Er du på jakt etter å overta en fullt ferdigutviklet, skalerbar B2B AI-programvarevirksomhet med over 92 % fortjenestemargin?</w:t>
+        <w:t>Hva er Hubzzoo CRM?</w:t>
       </w:r>
     </w:p>
     <w:p>
@@ -51,7 +307,7 @@
           <w:color w:val="334155"/>
           <w:sz w:val="21"/>
         </w:rPr>
-        <w:t>Nå har du muligheten til å sikre deg Hubzzoo CRM (hubzzoo.ai.studio) – et komplett, moderne CRM- og salgsautomatiseringssystem bygget på React 19, Express, Firebase Firestore, Stripe og Google Gemini AI.</w:t>
+        <w:t>Hubzzoo CRM fungerer som en intelligent AI-drevet salgssjef og assistent. Systemet automatiserer hele kundereisen: Det samler inn leads via visuelle skjemaer, analyserer selskapet og kontaktpersonen med Google Gemini AI, genererer skreddersydde tilbud og sender ut direkte Stripe-betalingslenker og e-poster i sanntid. Dette kutter administrativt arbeid med 80 % og lar selgere lukke avtaler raskere.</w:t>
       </w:r>
     </w:p>
     <w:p>
@@ -62,236 +318,9 @@
         <w:rPr>
           <w:b/>
           <w:color w:val="0F172A"/>
-          <w:sz w:val="30"/>
+          <w:sz w:val="28"/>
         </w:rPr>
-        <w:t>Finansielle Betingelser &amp; Prissetting</w:t>
-      </w:r>
-    </w:p>
-    <w:tbl>
-      <w:tblPr>
-        <w:tblW w:type="auto" w:w="0"/>
-        <w:jc w:val="center"/>
-        <w:tblLook w:firstColumn="1" w:firstRow="1" w:lastColumn="0" w:lastRow="0" w:noHBand="0" w:noVBand="1" w:val="04A0"/>
-      </w:tblPr>
-      <w:tblGrid>
-        <w:gridCol w:w="3120"/>
-        <w:gridCol w:w="3120"/>
-        <w:gridCol w:w="3120"/>
-      </w:tblGrid>
-      <w:tr>
-        <w:tc>
-          <w:tcPr>
-            <w:tcW w:type="dxa" w:w="3120"/>
-            <w:shd w:fill="E2E8F0"/>
-            <w:tcMar>
-              <w:top w:w="80" w:type="dxa"/>
-              <w:bottom w:w="80" w:type="dxa"/>
-              <w:left w:w="120" w:type="dxa"/>
-              <w:right w:w="120" w:type="dxa"/>
-            </w:tcMar>
-          </w:tcPr>
-          <w:p>
-            <w:r>
-              <w:rPr>
-                <w:b/>
-                <w:color w:val="0F172A"/>
-                <w:sz w:val="19"/>
-              </w:rPr>
-              <w:t>Element</w:t>
-            </w:r>
-          </w:p>
-        </w:tc>
-        <w:tc>
-          <w:tcPr>
-            <w:tcW w:type="dxa" w:w="3120"/>
-            <w:shd w:fill="E2E8F0"/>
-            <w:tcMar>
-              <w:top w:w="80" w:type="dxa"/>
-              <w:bottom w:w="80" w:type="dxa"/>
-              <w:left w:w="120" w:type="dxa"/>
-              <w:right w:w="120" w:type="dxa"/>
-            </w:tcMar>
-          </w:tcPr>
-          <w:p>
-            <w:r>
-              <w:rPr>
-                <w:b/>
-                <w:color w:val="0F172A"/>
-                <w:sz w:val="19"/>
-              </w:rPr>
-              <w:t>Anbefalt Pris</w:t>
-            </w:r>
-          </w:p>
-        </w:tc>
-        <w:tc>
-          <w:tcPr>
-            <w:tcW w:type="dxa" w:w="3120"/>
-            <w:shd w:fill="E2E8F0"/>
-            <w:tcMar>
-              <w:top w:w="80" w:type="dxa"/>
-              <w:bottom w:w="80" w:type="dxa"/>
-              <w:left w:w="120" w:type="dxa"/>
-              <w:right w:w="120" w:type="dxa"/>
-            </w:tcMar>
-          </w:tcPr>
-          <w:p>
-            <w:r>
-              <w:rPr>
-                <w:b/>
-                <w:color w:val="0F172A"/>
-                <w:sz w:val="19"/>
-              </w:rPr>
-              <w:t>Hva Kjøper Får</w:t>
-            </w:r>
-          </w:p>
-        </w:tc>
-      </w:tr>
-      <w:tr>
-        <w:tc>
-          <w:tcPr>
-            <w:tcW w:type="dxa" w:w="3120"/>
-            <w:shd w:fill="FFFFFF"/>
-            <w:tcMar>
-              <w:top w:w="60" w:type="dxa"/>
-              <w:bottom w:w="60" w:type="dxa"/>
-              <w:left w:w="100" w:type="dxa"/>
-              <w:right w:w="100" w:type="dxa"/>
-            </w:tcMar>
-          </w:tcPr>
-          <w:p>
-            <w:r>
-              <w:rPr>
-                <w:b/>
-                <w:sz w:val="18"/>
-              </w:rPr>
-              <w:t>1. Kjøpesum for Virksomheten (Engangsbeløp)</w:t>
-            </w:r>
-          </w:p>
-        </w:tc>
-        <w:tc>
-          <w:tcPr>
-            <w:tcW w:type="dxa" w:w="3120"/>
-            <w:shd w:fill="FFFFFF"/>
-            <w:tcMar>
-              <w:top w:w="60" w:type="dxa"/>
-              <w:bottom w:w="60" w:type="dxa"/>
-              <w:left w:w="100" w:type="dxa"/>
-              <w:right w:w="100" w:type="dxa"/>
-            </w:tcMar>
-          </w:tcPr>
-          <w:p>
-            <w:r>
-              <w:rPr>
-                <w:b/>
-                <w:color w:val="2563EB"/>
-                <w:sz w:val="18"/>
-              </w:rPr>
-              <w:t>kr 129 000,- NOK</w:t>
-              <w:br/>
-              <w:t>($12 900 USD)</w:t>
-            </w:r>
-          </w:p>
-        </w:tc>
-        <w:tc>
-          <w:tcPr>
-            <w:tcW w:type="dxa" w:w="3120"/>
-            <w:shd w:fill="FFFFFF"/>
-            <w:tcMar>
-              <w:top w:w="60" w:type="dxa"/>
-              <w:bottom w:w="60" w:type="dxa"/>
-              <w:left w:w="100" w:type="dxa"/>
-              <w:right w:w="100" w:type="dxa"/>
-            </w:tcMar>
-          </w:tcPr>
-          <w:p>
-            <w:r>
-              <w:rPr>
-                <w:sz w:val="18"/>
-              </w:rPr>
-              <w:t>100 % full eiendomsrett til hele Hubzzoo CRM-systemet, AI Executive Assistant, Nexus Editor, Firebase blueprint, Stripe-integrasjon og 3-års forretningsplan.</w:t>
-            </w:r>
-          </w:p>
-        </w:tc>
-      </w:tr>
-      <w:tr>
-        <w:tc>
-          <w:tcPr>
-            <w:tcW w:type="dxa" w:w="3120"/>
-            <w:shd w:fill="F8FAFC"/>
-            <w:tcMar>
-              <w:top w:w="60" w:type="dxa"/>
-              <w:bottom w:w="60" w:type="dxa"/>
-              <w:left w:w="100" w:type="dxa"/>
-              <w:right w:w="100" w:type="dxa"/>
-            </w:tcMar>
-          </w:tcPr>
-          <w:p>
-            <w:r>
-              <w:rPr>
-                <w:b/>
-                <w:sz w:val="18"/>
-              </w:rPr>
-              <w:t>2. Månedlig Drifts- &amp; Supportavtale (SLA)</w:t>
-            </w:r>
-          </w:p>
-        </w:tc>
-        <w:tc>
-          <w:tcPr>
-            <w:tcW w:type="dxa" w:w="3120"/>
-            <w:shd w:fill="F8FAFC"/>
-            <w:tcMar>
-              <w:top w:w="60" w:type="dxa"/>
-              <w:bottom w:w="60" w:type="dxa"/>
-              <w:left w:w="100" w:type="dxa"/>
-              <w:right w:w="100" w:type="dxa"/>
-            </w:tcMar>
-          </w:tcPr>
-          <w:p>
-            <w:r>
-              <w:rPr>
-                <w:b/>
-                <w:color w:val="10B981"/>
-                <w:sz w:val="18"/>
-              </w:rPr>
-              <w:t>kr 3 990,- / mnd</w:t>
-              <w:br/>
-              <w:t>($390 USD/mnd)</w:t>
-            </w:r>
-          </w:p>
-        </w:tc>
-        <w:tc>
-          <w:tcPr>
-            <w:tcW w:type="dxa" w:w="3120"/>
-            <w:shd w:fill="F8FAFC"/>
-            <w:tcMar>
-              <w:top w:w="60" w:type="dxa"/>
-              <w:bottom w:w="60" w:type="dxa"/>
-              <w:left w:w="100" w:type="dxa"/>
-              <w:right w:w="100" w:type="dxa"/>
-            </w:tcMar>
-          </w:tcPr>
-          <w:p>
-            <w:r>
-              <w:rPr>
-                <w:sz w:val="18"/>
-              </w:rPr>
-              <w:t>Full drift og overvåking på Google Cloud Run, Firebase databasedrift, Gemini AI API-kvoter, teknisk feilretting og prioritert support.</w:t>
-            </w:r>
-          </w:p>
-        </w:tc>
-      </w:tr>
-    </w:tbl>
-    <w:p>
-      <w:pPr>
-        <w:spacing w:before="280" w:after="80"/>
-      </w:pPr>
-      <w:r>
-        <w:rPr>
-          <w:b/>
-          <w:color w:val="0F172A"/>
-          <w:sz w:val="30"/>
-        </w:rPr>
-        <w:t>Hva Følger Med i Kjøpet (100 % Full Eiendomsrett):</w:t>
+        <w:t>Tekniske høydepunkter</w:t>
       </w:r>
     </w:p>
     <w:p>
@@ -305,14 +334,14 @@
           <w:color w:val="0F172A"/>
           <w:sz w:val="20"/>
         </w:rPr>
-        <w:t>1. Executive AI Assistant:</w:t>
+        <w:t xml:space="preserve">Moderne Tech-Stack: </w:t>
       </w:r>
       <w:r>
         <w:rPr>
           <w:color w:val="334155"/>
           <w:sz w:val="20"/>
         </w:rPr>
-        <w:t xml:space="preserve"> Intelligent AI-assistent drevet av Google Gemini som analyserer leads, gjør selskapsresearch og genererer tilbud på sekunder.</w:t>
+        <w:t>Bygget på React 19, TypeScript, Express, Firebase Firestore og Tailwind for lynrask respons og enterprise-sikkerhet.</w:t>
       </w:r>
     </w:p>
     <w:p>
@@ -326,14 +355,14 @@
           <w:color w:val="0F172A"/>
           <w:sz w:val="20"/>
         </w:rPr>
-        <w:t>2. Nexus Visual Lead Capture:</w:t>
+        <w:t xml:space="preserve">Google Gemini AI Assistent: </w:t>
       </w:r>
       <w:r>
         <w:rPr>
           <w:color w:val="334155"/>
           <w:sz w:val="20"/>
         </w:rPr>
-        <w:t xml:space="preserve"> Visuell landingsside-bygger som samler leads automatisk inn i salgspipelinen.</w:t>
+        <w:t>Integrert AI-motor som automatisk gjør bakgrunnsresearch på selskaper og formulerer vinnende salgstilbud.</w:t>
       </w:r>
     </w:p>
     <w:p>
@@ -347,14 +376,14 @@
           <w:color w:val="0F172A"/>
           <w:sz w:val="20"/>
         </w:rPr>
-        <w:t>3. Stripe Betalingsintegrasjon:</w:t>
+        <w:t xml:space="preserve">Nexus Lead Builder: </w:t>
       </w:r>
       <w:r>
         <w:rPr>
           <w:color w:val="334155"/>
           <w:sz w:val="20"/>
         </w:rPr>
-        <w:t xml:space="preserve"> Direkte opprettelse og utsending av Stripe-betalingslenker fra CRM-et.</w:t>
+        <w:t>Innebygd visuell landingsside- og skjemabygger som sluser nye leads direkte inn i salgspipelinen.</w:t>
       </w:r>
     </w:p>
     <w:p>
@@ -368,14 +397,14 @@
           <w:color w:val="0F172A"/>
           <w:sz w:val="20"/>
         </w:rPr>
-        <w:t>4. Smart E-postoppfølging:</w:t>
+        <w:t xml:space="preserve">Komplett Betalingsflyt: </w:t>
       </w:r>
       <w:r>
         <w:rPr>
           <w:color w:val="334155"/>
           <w:sz w:val="20"/>
         </w:rPr>
-        <w:t xml:space="preserve"> Automatiserte e-postsekvenser via Nodemailer/SMTP basert på kundestatus.</w:t>
+        <w:t>Integrert Stripe-betaling som genererer 1-klikks betalingslenker og fakturaoppfølging.</w:t>
       </w:r>
     </w:p>
     <w:p>
@@ -389,14 +418,14 @@
           <w:color w:val="0F172A"/>
           <w:sz w:val="20"/>
         </w:rPr>
-        <w:t>5. Dokumentasjon &amp; Forretningsplan:</w:t>
+        <w:t xml:space="preserve">Live &amp; Produksjonsklar: </w:t>
       </w:r>
       <w:r>
         <w:rPr>
           <w:color w:val="334155"/>
           <w:sz w:val="20"/>
         </w:rPr>
-        <w:t xml:space="preserve"> Komplett 3-års forretningsplan, Go-To-Market plan og finansiell modell.</w:t>
+        <w:t>Skybasert container konfigurert for Google Cloud Run med 99,9 % oppetid.</w:t>
       </w:r>
     </w:p>
     <w:p>
@@ -407,9 +436,219 @@
         <w:rPr>
           <w:b/>
           <w:color w:val="0F172A"/>
-          <w:sz w:val="30"/>
+          <w:sz w:val="28"/>
         </w:rPr>
-        <w:t>Kontakt &amp; Overdragelse:</w:t>
+        <w:t>Markedspotensial &amp; Forretningsmodell</w:t>
+      </w:r>
+    </w:p>
+    <w:p>
+      <w:pPr>
+        <w:spacing w:after="80" w:line="276" w:lineRule="auto"/>
+      </w:pPr>
+      <w:r>
+        <w:rPr>
+          <w:b w:val="0"/>
+          <w:color w:val="334155"/>
+          <w:sz w:val="21"/>
+        </w:rPr>
+        <w:t>B2B CRM-markedet er et av verdens mest lukrative programvaremarkeder. Hubzzoo løser bedrifters største utfordring: Tidsbruk på manuelle tilbud og oppfølging.</w:t>
+      </w:r>
+    </w:p>
+    <w:p>
+      <w:pPr>
+        <w:spacing w:after="80" w:line="276" w:lineRule="auto"/>
+      </w:pPr>
+      <w:r>
+        <w:rPr>
+          <w:b w:val="0"/>
+          <w:color w:val="334155"/>
+          <w:sz w:val="21"/>
+        </w:rPr>
+        <w:t>Monetisering via 3 faste inntektsstrømmer:</w:t>
+      </w:r>
+    </w:p>
+    <w:p>
+      <w:pPr>
+        <w:spacing w:after="80" w:line="276" w:lineRule="auto"/>
+      </w:pPr>
+      <w:r>
+        <w:rPr>
+          <w:b w:val="0"/>
+          <w:color w:val="334155"/>
+          <w:sz w:val="21"/>
+        </w:rPr>
+        <w:t>1. Månedlige SaaS-abonnementer ($29, $79 og $199 per måned).</w:t>
+      </w:r>
+    </w:p>
+    <w:p>
+      <w:pPr>
+        <w:spacing w:after="80" w:line="276" w:lineRule="auto"/>
+      </w:pPr>
+      <w:r>
+        <w:rPr>
+          <w:b w:val="0"/>
+          <w:color w:val="334155"/>
+          <w:sz w:val="21"/>
+        </w:rPr>
+        <w:t>2. Whitelabel- og bedriftslisenser til konsulentselskaper og byråer.</w:t>
+      </w:r>
+    </w:p>
+    <w:p>
+      <w:pPr>
+        <w:spacing w:after="80" w:line="276" w:lineRule="auto"/>
+      </w:pPr>
+      <w:r>
+        <w:rPr>
+          <w:b w:val="0"/>
+          <w:color w:val="334155"/>
+          <w:sz w:val="21"/>
+        </w:rPr>
+        <w:t>3. AppSumo / Lifetime Deal-kampanje for umiddelbar kontantstrøm ved lansering.</w:t>
+      </w:r>
+    </w:p>
+    <w:p>
+      <w:pPr>
+        <w:spacing w:before="280" w:after="80"/>
+      </w:pPr>
+      <w:r>
+        <w:rPr>
+          <w:b/>
+          <w:color w:val="0F172A"/>
+          <w:sz w:val="28"/>
+        </w:rPr>
+        <w:t>Hvorfor selges den?</w:t>
+      </w:r>
+    </w:p>
+    <w:p>
+      <w:pPr>
+        <w:spacing w:after="80" w:line="276" w:lineRule="auto"/>
+      </w:pPr>
+      <w:r>
+        <w:rPr>
+          <w:b w:val="0"/>
+          <w:color w:val="334155"/>
+          <w:sz w:val="21"/>
+        </w:rPr>
+        <w:t>Systemet selges som det står – 100 % ferdigutviklet, testet og teknisk optimalisert. Eier har for mange parallelle utviklingsprosjekter gående til å drive aktivt salg og kundebearbeiding. Dette er en nøkkelferdig forretningsmulighet for en salgsorientert person, markedsfører eller investor som ønsker å eie en skalerbar AI-plattform med over 92 % profittmargin.</w:t>
+      </w:r>
+    </w:p>
+    <w:p>
+      <w:pPr>
+        <w:spacing w:before="280" w:after="80"/>
+      </w:pPr>
+      <w:r>
+        <w:rPr>
+          <w:b/>
+          <w:color w:val="0F172A"/>
+          <w:sz w:val="28"/>
+        </w:rPr>
+        <w:t>Inkludert i salget</w:t>
+      </w:r>
+    </w:p>
+    <w:p>
+      <w:pPr>
+        <w:pStyle w:val="ListBullet"/>
+        <w:spacing w:after="60" w:line="276" w:lineRule="auto"/>
+      </w:pPr>
+      <w:r>
+        <w:rPr>
+          <w:color w:val="334155"/>
+          <w:sz w:val="20"/>
+        </w:rPr>
+        <w:t>Full overdragelse av kildekode og GitHub-repository (aiappsy/aistudio-crm-app).</w:t>
+      </w:r>
+    </w:p>
+    <w:p>
+      <w:pPr>
+        <w:pStyle w:val="ListBullet"/>
+        <w:spacing w:after="60" w:line="276" w:lineRule="auto"/>
+      </w:pPr>
+      <w:r>
+        <w:rPr>
+          <w:color w:val="334155"/>
+          <w:sz w:val="20"/>
+        </w:rPr>
+        <w:t>Komplett Firebase- og Firestore-databaseoppsett.</w:t>
+      </w:r>
+    </w:p>
+    <w:p>
+      <w:pPr>
+        <w:pStyle w:val="ListBullet"/>
+        <w:spacing w:after="60" w:line="276" w:lineRule="auto"/>
+      </w:pPr>
+      <w:r>
+        <w:rPr>
+          <w:color w:val="334155"/>
+          <w:sz w:val="20"/>
+        </w:rPr>
+        <w:t>Stripe- og Nodemailer-integrasjoner.</w:t>
+      </w:r>
+    </w:p>
+    <w:p>
+      <w:pPr>
+        <w:pStyle w:val="ListBullet"/>
+        <w:spacing w:after="60" w:line="276" w:lineRule="auto"/>
+      </w:pPr>
+      <w:r>
+        <w:rPr>
+          <w:color w:val="334155"/>
+          <w:sz w:val="20"/>
+        </w:rPr>
+        <w:t>Full 3-års forretningsplan, markedsstrategi og økonomiske modeller.</w:t>
+      </w:r>
+    </w:p>
+    <w:p>
+      <w:pPr>
+        <w:pStyle w:val="ListBullet"/>
+        <w:spacing w:after="60" w:line="276" w:lineRule="auto"/>
+      </w:pPr>
+      <w:r>
+        <w:rPr>
+          <w:color w:val="334155"/>
+          <w:sz w:val="20"/>
+        </w:rPr>
+        <w:t>1-til-1 digital onboarding (2 timer).</w:t>
+      </w:r>
+    </w:p>
+    <w:p>
+      <w:pPr>
+        <w:spacing w:before="280" w:after="80"/>
+      </w:pPr>
+      <w:r>
+        <w:rPr>
+          <w:b/>
+          <w:color w:val="0F172A"/>
+          <w:sz w:val="28"/>
+        </w:rPr>
+        <w:t>Pris og Betingelser</w:t>
+      </w:r>
+    </w:p>
+    <w:p>
+      <w:pPr>
+        <w:spacing w:after="80" w:line="276" w:lineRule="auto"/>
+      </w:pPr>
+      <w:r>
+        <w:rPr>
+          <w:b/>
+          <w:color w:val="334155"/>
+          <w:sz w:val="21"/>
+        </w:rPr>
+        <w:t>Kjøpesum: Kr. 129 000,- NOK (Engangsbeløp for 100 % fullt eierskap)</w:t>
+        <w:br/>
+        <w:t>Valgfri månedlig drifts- og SLA-avtale: Kr. 3 990,- NOK / måned (dekker Google Cloud Run servere, Firebase-drift, Gemini AI-kvoter og teknisk support).</w:t>
+      </w:r>
+    </w:p>
+    <w:p>
+      <w:pPr>
+        <w:spacing w:before="280" w:after="80"/>
+      </w:pPr>
+      <w:r>
+        <w:rPr>
+          <w:b/>
+          <w:color w:val="0F172A"/>
+          <w:sz w:val="28"/>
+        </w:rPr>
+        <w:t>Kontaktinformasjon</w:t>
       </w:r>
     </w:p>
     <w:p>
@@ -423,14 +662,14 @@
           <w:color w:val="0F172A"/>
           <w:sz w:val="20"/>
         </w:rPr>
-        <w:t>1. Avtale:</w:t>
+        <w:t>Firma:</w:t>
       </w:r>
       <w:r>
         <w:rPr>
           <w:color w:val="334155"/>
           <w:sz w:val="20"/>
         </w:rPr>
-        <w:t xml:space="preserve"> Signering av kjøpekontrakt og overdragelsesavtale.</w:t>
+        <w:t xml:space="preserve"> Hubzzoo / aiappsy</w:t>
       </w:r>
     </w:p>
     <w:p>
@@ -444,14 +683,14 @@
           <w:color w:val="0F172A"/>
           <w:sz w:val="20"/>
         </w:rPr>
-        <w:t>2. Overføring:</w:t>
+        <w:t>Kontaktperson:</w:t>
       </w:r>
       <w:r>
         <w:rPr>
           <w:color w:val="334155"/>
           <w:sz w:val="20"/>
         </w:rPr>
-        <w:t xml:space="preserve"> Overføring av GitHub-kildekode, Firebase-prosjekt, tilganger og domener.</w:t>
+        <w:t xml:space="preserve"> Pål Alexander Juritzen</w:t>
       </w:r>
     </w:p>
     <w:p>
@@ -465,30 +704,35 @@
           <w:color w:val="0F172A"/>
           <w:sz w:val="20"/>
         </w:rPr>
-        <w:t>3. Onboarding:</w:t>
+        <w:t>E-post:</w:t>
       </w:r>
       <w:r>
         <w:rPr>
           <w:color w:val="334155"/>
           <w:sz w:val="20"/>
         </w:rPr>
-        <w:t xml:space="preserve"> 1-til-1 digital onboarding (2 timer) for full teknisk og operasjonell innføring.</w:t>
+        <w:t xml:space="preserve"> paljuritzen@gmail.com</w:t>
       </w:r>
     </w:p>
     <w:p>
       <w:pPr>
-        <w:spacing w:after="80" w:line="276" w:lineRule="auto"/>
+        <w:pStyle w:val="ListBullet"/>
+        <w:spacing w:after="60" w:line="276" w:lineRule="auto"/>
       </w:pPr>
       <w:r>
         <w:rPr>
           <w:b/>
+          <w:color w:val="0F172A"/>
+          <w:sz w:val="20"/>
+        </w:rPr>
+        <w:t>Nettside:</w:t>
+      </w:r>
+      <w:r>
+        <w:rPr>
           <w:color w:val="334155"/>
-          <w:sz w:val="21"/>
+          <w:sz w:val="20"/>
         </w:rPr>
-        <w:br/>
-        <w:t>Kontakt for demo og oversendelse av fullt prospekt:</w:t>
-        <w:br/>
-        <w:t>E-post: paljuritzen@gmail.com | GitHub: github.com/aiappsy/aistudio-crm-app</w:t>
+        <w:t xml:space="preserve"> https://hubzzoo.ai.studio / https://github.com/aiappsy/aistudio-crm-app</w:t>
       </w:r>
     </w:p>
     <w:sectPr>

</xml_diff>